<commit_message>
Word summative: no info-grid shading, repeat candidate header, keep mean-deviation with signatory, exact sample signatory block
- Info grid tblLook set to noHBand=1 (matches the sample) so the Plain
  Table 4 row banding/shading no longer appears.
- Candidate table header row marked as a repeating header (tblHeader), so
  it reprints on every page that has candidate rows.
- 'Mean Deviation' line + signatory block kept on one page via keepNext on
  the lead-in paragraphs and cantSplit/keepNext across the signatory rows.
- Signatory block now comes verbatim from the sample: the donor template
  retains that exact table and the generator repositions it into place,
  rather than reconstructing it.

Co-Authored-By: Claude Fable 5 <noreply@anthropic.com>
</commit_message>
<xml_diff>
--- a/summative_word_template.docx
+++ b/summative_word_template.docx
@@ -2,6 +2,248 @@
 <file path=word/document.xml><?xml version="1.0" encoding="utf-8"?>
 <w:document xmlns:wpc="http://schemas.microsoft.com/office/word/2010/wordprocessingCanvas" xmlns:cx="http://schemas.microsoft.com/office/drawing/2014/chartex" xmlns:cx1="http://schemas.microsoft.com/office/drawing/2015/9/8/chartex" xmlns:cx2="http://schemas.microsoft.com/office/drawing/2015/10/21/chartex" xmlns:cx3="http://schemas.microsoft.com/office/drawing/2016/5/9/chartex" xmlns:cx4="http://schemas.microsoft.com/office/drawing/2016/5/10/chartex" xmlns:cx5="http://schemas.microsoft.com/office/drawing/2016/5/11/chartex" xmlns:cx6="http://schemas.microsoft.com/office/drawing/2016/5/12/chartex" xmlns:cx7="http://schemas.microsoft.com/office/drawing/2016/5/13/chartex" xmlns:cx8="http://schemas.microsoft.com/office/drawing/2016/5/14/chartex" xmlns:mc="http://schemas.openxmlformats.org/markup-compatibility/2006" xmlns:aink="http://schemas.microsoft.com/office/drawing/2016/ink" xmlns:am3d="http://schemas.microsoft.com/office/drawing/2017/model3d" xmlns:o="urn:schemas-microsoft-com:office:office" xmlns:oel="http://schemas.microsoft.com/office/2019/extlst" xmlns:r="http://schemas.openxmlformats.org/officeDocument/2006/relationships" xmlns:m="http://schemas.openxmlformats.org/officeDocument/2006/math" xmlns:v="urn:schemas-microsoft-com:vml" xmlns:wp14="http://schemas.microsoft.com/office/word/2010/wordprocessingDrawing" xmlns:wp="http://schemas.openxmlformats.org/drawingml/2006/wordprocessingDrawing" xmlns:w10="urn:schemas-microsoft-com:office:word" xmlns:w="http://schemas.openxmlformats.org/wordprocessingml/2006/main" xmlns:w14="http://schemas.microsoft.com/office/word/2010/wordml" xmlns:w15="http://schemas.microsoft.com/office/word/2012/wordml" xmlns:w16cex="http://schemas.microsoft.com/office/word/2018/wordml/cex" xmlns:w16cid="http://schemas.microsoft.com/office/word/2016/wordml/cid" xmlns:w16="http://schemas.microsoft.com/office/word/2018/wordml" xmlns:w16du="http://schemas.microsoft.com/office/word/2023/wordml/word16du" xmlns:w16sdtdh="http://schemas.microsoft.com/office/word/2020/wordml/sdtdatahash" xmlns:w16sdtfl="http://schemas.microsoft.com/office/word/2024/wordml/sdtformatlock" xmlns:w16se="http://schemas.microsoft.com/office/word/2015/wordml/symex" xmlns:wpg="http://schemas.microsoft.com/office/word/2010/wordprocessingGroup" xmlns:wpi="http://schemas.microsoft.com/office/word/2010/wordprocessingInk" xmlns:wne="http://schemas.microsoft.com/office/word/2006/wordml" xmlns:wps="http://schemas.microsoft.com/office/word/2010/wordprocessingShape" mc:Ignorable="w14 w15 w16se w16cid w16 w16cex w16sdtdh w16sdtfl w16du wp14">
   <w:body>
+    <w:tbl>
+      <w:tblPr>
+        <w:tblStyle w:val="PlainTable4"/>
+        <w:tblW w:w="0" w:type="auto"/>
+        <w:tblLook w:val="0600" w:firstRow="0" w:lastRow="0" w:firstColumn="0" w:lastColumn="0" w:noHBand="1" w:noVBand="1"/>
+      </w:tblPr>
+      <w:tblGrid>
+        <w:gridCol w:w="15398"/>
+      </w:tblGrid>
+      <w:tr>
+        <w:tc>
+          <w:tcPr>
+            <w:tcW w:w="15614" w:type="dxa"/>
+          </w:tcPr>
+          <w:p>
+            <w:pPr>
+              <w:spacing w:before="240" w:after="40" w:line="360" w:lineRule="auto"/>
+              <w:rPr>
+                <w:bCs/>
+              </w:rPr>
+            </w:pPr>
+            <w:r>
+              <w:rPr>
+                <w:b/>
+              </w:rPr>
+              <w:t xml:space="preserve">1. Name of Internal Assessor:  </w:t>
+            </w:r>
+            <w:r>
+              <w:t>........................................</w:t>
+            </w:r>
+            <w:r>
+              <w:rPr>
+                <w:bCs/>
+              </w:rPr>
+              <w:t>................................................................................................................................................................</w:t>
+            </w:r>
+          </w:p>
+        </w:tc>
+      </w:tr>
+      <w:tr>
+        <w:tc>
+          <w:tcPr>
+            <w:tcW w:w="15614" w:type="dxa"/>
+          </w:tcPr>
+          <w:p>
+            <w:pPr>
+              <w:spacing w:before="240" w:after="40" w:line="360" w:lineRule="auto"/>
+            </w:pPr>
+            <w:r>
+              <w:rPr>
+                <w:b/>
+              </w:rPr>
+              <w:t xml:space="preserve">Internal Assessor Reg. Code/National ID. No.: </w:t>
+            </w:r>
+            <w:r>
+              <w:t>................</w:t>
+            </w:r>
+            <w:r>
+              <w:rPr>
+                <w:bCs/>
+              </w:rPr>
+              <w:t>.............................................................</w:t>
+            </w:r>
+            <w:r>
+              <w:rPr>
+                <w:b/>
+              </w:rPr>
+              <w:tab/>
+            </w:r>
+            <w:r>
+              <w:rPr>
+                <w:b/>
+              </w:rPr>
+              <w:t xml:space="preserve">Signature: </w:t>
+            </w:r>
+            <w:r>
+              <w:t>................</w:t>
+            </w:r>
+            <w:r>
+              <w:t>.............</w:t>
+            </w:r>
+            <w:r>
+              <w:rPr>
+                <w:b/>
+              </w:rPr>
+              <w:t xml:space="preserve">  Date: </w:t>
+            </w:r>
+            <w:r>
+              <w:t>............</w:t>
+            </w:r>
+            <w:r>
+              <w:t>.......................</w:t>
+            </w:r>
+          </w:p>
+        </w:tc>
+      </w:tr>
+      <w:tr>
+        <w:tc>
+          <w:tcPr>
+            <w:tcW w:w="15614" w:type="dxa"/>
+          </w:tcPr>
+          <w:p>
+            <w:pPr>
+              <w:spacing w:before="240" w:after="40" w:line="360" w:lineRule="auto"/>
+            </w:pPr>
+            <w:r>
+              <w:rPr>
+                <w:b/>
+              </w:rPr>
+              <w:t xml:space="preserve">2. Name of External Verifier:  </w:t>
+            </w:r>
+            <w:r>
+              <w:t>......................................................................</w:t>
+            </w:r>
+            <w:r>
+              <w:t>...................................................................................................................................</w:t>
+            </w:r>
+          </w:p>
+        </w:tc>
+      </w:tr>
+      <w:tr>
+        <w:tc>
+          <w:tcPr>
+            <w:tcW w:w="15614" w:type="dxa"/>
+          </w:tcPr>
+          <w:p>
+            <w:pPr>
+              <w:spacing w:before="240" w:after="40" w:line="360" w:lineRule="auto"/>
+            </w:pPr>
+            <w:r>
+              <w:rPr>
+                <w:b/>
+              </w:rPr>
+              <w:t xml:space="preserve">External Verifier Reg. Code/National ID. No.: </w:t>
+            </w:r>
+            <w:r>
+              <w:t>................</w:t>
+            </w:r>
+            <w:r>
+              <w:rPr>
+                <w:bCs/>
+              </w:rPr>
+              <w:t>.............................................................</w:t>
+            </w:r>
+            <w:r>
+              <w:rPr>
+                <w:b/>
+              </w:rPr>
+              <w:tab/>
+              <w:t xml:space="preserve">Signature: </w:t>
+            </w:r>
+            <w:r>
+              <w:t>.............................</w:t>
+            </w:r>
+            <w:r>
+              <w:rPr>
+                <w:b/>
+              </w:rPr>
+              <w:t xml:space="preserve">  Date: </w:t>
+            </w:r>
+            <w:r>
+              <w:t>...................................</w:t>
+            </w:r>
+          </w:p>
+        </w:tc>
+      </w:tr>
+      <w:tr>
+        <w:tc>
+          <w:tcPr>
+            <w:tcW w:w="15614" w:type="dxa"/>
+          </w:tcPr>
+          <w:p>
+            <w:pPr>
+              <w:spacing w:before="240" w:after="40" w:line="360" w:lineRule="auto"/>
+            </w:pPr>
+            <w:r>
+              <w:rPr>
+                <w:b/>
+              </w:rPr>
+              <w:t xml:space="preserve">3. Name of Assessment Center Manager/Officer:  </w:t>
+            </w:r>
+            <w:r>
+              <w:t>.............................................</w:t>
+            </w:r>
+            <w:r>
+              <w:t>...........................................................................................................................</w:t>
+            </w:r>
+          </w:p>
+        </w:tc>
+      </w:tr>
+      <w:tr>
+        <w:tc>
+          <w:tcPr>
+            <w:tcW w:w="15614" w:type="dxa"/>
+          </w:tcPr>
+          <w:p>
+            <w:pPr>
+              <w:spacing w:before="240" w:line="360" w:lineRule="auto"/>
+            </w:pPr>
+            <w:r>
+              <w:rPr>
+                <w:b/>
+              </w:rPr>
+              <w:t xml:space="preserve">Signature: </w:t>
+            </w:r>
+            <w:r>
+              <w:t>.............................</w:t>
+            </w:r>
+            <w:r>
+              <w:rPr>
+                <w:b/>
+              </w:rPr>
+              <w:t xml:space="preserve">  Date: </w:t>
+            </w:r>
+            <w:r>
+              <w:t>...................................</w:t>
+            </w:r>
+            <w:r>
+              <w:t xml:space="preserve"> </w:t>
+            </w:r>
+            <w:r>
+              <w:rPr>
+                <w:b/>
+              </w:rPr>
+              <w:t>Institutional Stamp</w:t>
+            </w:r>
+            <w:r>
+              <w:rPr>
+                <w:b/>
+              </w:rPr>
+              <w:t xml:space="preserve">: </w:t>
+            </w:r>
+            <w:r>
+              <w:t>...................................</w:t>
+            </w:r>
+            <w:r>
+              <w:t>......................................................................................</w:t>
+            </w:r>
+          </w:p>
+        </w:tc>
+      </w:tr>
+    </w:tbl>
     <w:sectPr>
       <w:pgSz w:w="16838" w:h="11906" w:orient="landscape"/>
       <w:pgMar w:top="720" w:right="720" w:bottom="720" w:left="720" w:header="720" w:footer="720" w:gutter="0"/>

</xml_diff>